<commit_message>
deleted:    06_SDLC/SDD_Unterlagen/CheatSheet_SDD.pdf 	modified:   06_SDLC/SDD_Unterlagen/SDD-Handreichung.docx 	deleted:    06_SDLC/SDD_Unterlagen/SDD-Handreichung.pdf
</commit_message>
<xml_diff>
--- a/06_SDLC/SDD_Unterlagen/SDD-Handreichung.docx
+++ b/06_SDLC/SDD_Unterlagen/SDD-Handreichung.docx
@@ -54,7 +54,7 @@
     </w:p>
     <w:tbl>
       <w:tblPr>
-        <w:tblW w:w="9026" w:type="dxa"/>
+        <w:tblW w:w="10455" w:type="dxa"/>
         <w:tblBorders>
           <w:top w:val="single" w:sz="4" w:space="0" w:color="auto"/>
           <w:left w:val="single" w:sz="4" w:space="0" w:color="auto"/>
@@ -70,12 +70,12 @@
         <w:tblLook w:val="04A0" w:firstRow="1" w:lastRow="0" w:firstColumn="1" w:lastColumn="0" w:noHBand="0" w:noVBand="1"/>
       </w:tblPr>
       <w:tblGrid>
-        <w:gridCol w:w="9026"/>
+        <w:gridCol w:w="10455"/>
       </w:tblGrid>
       <w:tr>
         <w:tc>
           <w:tcPr>
-            <w:tcW w:w="9026" w:type="dxa"/>
+            <w:tcW w:w="10455" w:type="dxa"/>
             <w:tcBorders>
               <w:left w:val="single" w:sz="28" w:space="0" w:color="1F4E79"/>
             </w:tcBorders>
@@ -2363,7 +2363,7 @@
         </w:rPr>
         <w:lastRenderedPageBreak/>
         <w:drawing>
-          <wp:anchor distT="0" distB="0" distL="114300" distR="114300" simplePos="0" relativeHeight="251658240" behindDoc="1" locked="0" layoutInCell="1" allowOverlap="1" wp14:anchorId="456F44F6" wp14:editId="59DA48A5">
+          <wp:anchor distT="0" distB="0" distL="114300" distR="114300" simplePos="0" relativeHeight="251658240" behindDoc="1" locked="0" layoutInCell="1" allowOverlap="1" wp14:anchorId="456F44F6" wp14:editId="46B548DD">
             <wp:simplePos x="0" y="0"/>
             <wp:positionH relativeFrom="column">
               <wp:posOffset>139065</wp:posOffset>
@@ -4411,75 +4411,6 @@
     </w:p>
     <w:p>
       <w:pPr>
-        <w:pStyle w:val="ListParagraph"/>
-        <w:numPr>
-          <w:ilvl w:val="0"/>
-          <w:numId w:val="3"/>
-        </w:numPr>
-        <w:spacing w:after="90" w:line="272" w:lineRule="auto"/>
-      </w:pPr>
-    </w:p>
-    <w:tbl>
-      <w:tblPr>
-        <w:tblW w:w="10313" w:type="dxa"/>
-        <w:tblBorders>
-          <w:top w:val="single" w:sz="4" w:space="0" w:color="auto"/>
-          <w:left w:val="single" w:sz="4" w:space="0" w:color="auto"/>
-          <w:bottom w:val="single" w:sz="4" w:space="0" w:color="auto"/>
-          <w:right w:val="single" w:sz="4" w:space="0" w:color="auto"/>
-          <w:insideH w:val="single" w:sz="4" w:space="0" w:color="auto"/>
-          <w:insideV w:val="single" w:sz="4" w:space="0" w:color="auto"/>
-        </w:tblBorders>
-        <w:tblCellMar>
-          <w:left w:w="10" w:type="dxa"/>
-          <w:right w:w="10" w:type="dxa"/>
-        </w:tblCellMar>
-        <w:tblLook w:val="04A0" w:firstRow="1" w:lastRow="0" w:firstColumn="1" w:lastColumn="0" w:noHBand="0" w:noVBand="1"/>
-      </w:tblPr>
-      <w:tblGrid>
-        <w:gridCol w:w="10313"/>
-      </w:tblGrid>
-      <w:tr>
-        <w:tc>
-          <w:tcPr>
-            <w:tcW w:w="10313" w:type="dxa"/>
-            <w:tcBorders>
-              <w:left w:val="single" w:sz="28" w:space="0" w:color="2E7D32"/>
-            </w:tcBorders>
-            <w:shd w:val="clear" w:color="auto" w:fill="E8F3E8"/>
-            <w:tcMar>
-              <w:top w:w="140" w:type="dxa"/>
-              <w:left w:w="220" w:type="dxa"/>
-              <w:bottom w:w="140" w:type="dxa"/>
-              <w:right w:w="200" w:type="dxa"/>
-            </w:tcMar>
-          </w:tcPr>
-          <w:p>
-            <w:pPr>
-              <w:spacing w:after="80"/>
-            </w:pPr>
-            <w:r>
-              <w:rPr>
-                <w:b/>
-                <w:bCs/>
-                <w:color w:val="256528"/>
-              </w:rPr>
-              <w:t>Faustregel zur Auswahl</w:t>
-            </w:r>
-          </w:p>
-          <w:p>
-            <w:pPr>
-              <w:spacing w:line="276" w:lineRule="auto"/>
-            </w:pPr>
-            <w:r>
-              <w:t>SDD lohnt sich bei langlebigen, mehrköpfigen, korrektheits- oder compliance-kritischen Projekten und beim Arbeiten in bestehenden Codebasen. Für Exploration, Lernprojekte und Einweg-Skripte genügt Vibe Coding — und ist oft schneller.</w:t>
-            </w:r>
-          </w:p>
-        </w:tc>
-      </w:tr>
-    </w:tbl>
-    <w:p>
-      <w:pPr>
         <w:spacing w:line="120" w:lineRule="auto"/>
       </w:pPr>
     </w:p>
@@ -5126,7 +5057,7 @@
         <w:t>Beantworten:</w:t>
       </w:r>
       <w:r>
-        <w:t xml:space="preserve"> kurz und knapp auf die Fragen antworten (z. B. „Zu 3: Option B. Zu 4: React und Firebase“).</w:t>
+        <w:t xml:space="preserve"> kurz und knapp auf antworten (z. B. „Zu 3: Option B. Zu 4: React und Firebase“).</w:t>
       </w:r>
     </w:p>
     <w:p>
@@ -6470,65 +6401,6 @@
         <w:spacing w:line="120" w:lineRule="auto"/>
       </w:pPr>
     </w:p>
-    <w:tbl>
-      <w:tblPr>
-        <w:tblW w:w="10313" w:type="dxa"/>
-        <w:tblBorders>
-          <w:top w:val="single" w:sz="4" w:space="0" w:color="auto"/>
-          <w:left w:val="single" w:sz="4" w:space="0" w:color="auto"/>
-          <w:bottom w:val="single" w:sz="4" w:space="0" w:color="auto"/>
-          <w:right w:val="single" w:sz="4" w:space="0" w:color="auto"/>
-          <w:insideH w:val="single" w:sz="4" w:space="0" w:color="auto"/>
-          <w:insideV w:val="single" w:sz="4" w:space="0" w:color="auto"/>
-        </w:tblBorders>
-        <w:tblCellMar>
-          <w:left w:w="10" w:type="dxa"/>
-          <w:right w:w="10" w:type="dxa"/>
-        </w:tblCellMar>
-        <w:tblLook w:val="04A0" w:firstRow="1" w:lastRow="0" w:firstColumn="1" w:lastColumn="0" w:noHBand="0" w:noVBand="1"/>
-      </w:tblPr>
-      <w:tblGrid>
-        <w:gridCol w:w="10313"/>
-      </w:tblGrid>
-      <w:tr>
-        <w:tc>
-          <w:tcPr>
-            <w:tcW w:w="10313" w:type="dxa"/>
-            <w:tcBorders>
-              <w:left w:val="single" w:sz="28" w:space="0" w:color="B26A00"/>
-            </w:tcBorders>
-            <w:shd w:val="clear" w:color="auto" w:fill="FBF3E2"/>
-            <w:tcMar>
-              <w:top w:w="140" w:type="dxa"/>
-              <w:left w:w="220" w:type="dxa"/>
-              <w:bottom w:w="140" w:type="dxa"/>
-              <w:right w:w="200" w:type="dxa"/>
-            </w:tcMar>
-          </w:tcPr>
-          <w:p>
-            <w:pPr>
-              <w:spacing w:after="80"/>
-            </w:pPr>
-            <w:r>
-              <w:rPr>
-                <w:b/>
-                <w:bCs/>
-                <w:color w:val="9C5A00"/>
-              </w:rPr>
-              <w:t>Kostenhinweis</w:t>
-            </w:r>
-          </w:p>
-          <w:p>
-            <w:pPr>
-              <w:spacing w:line="276" w:lineRule="auto"/>
-            </w:pPr>
-            <w:r>
-              <w:t>Agent-Modus und Claude Code verbrauchen Tokens (= Geld). Fang mit kleinen Aufgaben an und behalte den Verbrauch im Blick. Wer sparen will, nutzt Continue mit einem günstigen oder lokalen Modell für die einfachen Schritte.</w:t>
-            </w:r>
-          </w:p>
-        </w:tc>
-      </w:tr>
-    </w:tbl>
     <w:p>
       <w:pPr>
         <w:spacing w:line="120" w:lineRule="auto"/>
@@ -7176,12 +7048,6 @@
         <w:gridCol w:w="5670"/>
       </w:tblGrid>
       <w:tr>
-        <w:tblPrEx>
-          <w:tblCellMar>
-            <w:top w:w="0" w:type="dxa"/>
-            <w:bottom w:w="0" w:type="dxa"/>
-          </w:tblCellMar>
-        </w:tblPrEx>
         <w:trPr>
           <w:tblHeader/>
         </w:trPr>
@@ -7268,12 +7134,6 @@
         </w:tc>
       </w:tr>
       <w:tr>
-        <w:tblPrEx>
-          <w:tblCellMar>
-            <w:top w:w="0" w:type="dxa"/>
-            <w:bottom w:w="0" w:type="dxa"/>
-          </w:tblCellMar>
-        </w:tblPrEx>
         <w:tc>
           <w:tcPr>
             <w:tcW w:w="1838" w:type="dxa"/>
@@ -7352,12 +7212,6 @@
         </w:tc>
       </w:tr>
       <w:tr>
-        <w:tblPrEx>
-          <w:tblCellMar>
-            <w:top w:w="0" w:type="dxa"/>
-            <w:bottom w:w="0" w:type="dxa"/>
-          </w:tblCellMar>
-        </w:tblPrEx>
         <w:tc>
           <w:tcPr>
             <w:tcW w:w="1838" w:type="dxa"/>
@@ -7436,12 +7290,6 @@
         </w:tc>
       </w:tr>
       <w:tr>
-        <w:tblPrEx>
-          <w:tblCellMar>
-            <w:top w:w="0" w:type="dxa"/>
-            <w:bottom w:w="0" w:type="dxa"/>
-          </w:tblCellMar>
-        </w:tblPrEx>
         <w:tc>
           <w:tcPr>
             <w:tcW w:w="1838" w:type="dxa"/>
@@ -7520,12 +7368,6 @@
         </w:tc>
       </w:tr>
       <w:tr>
-        <w:tblPrEx>
-          <w:tblCellMar>
-            <w:top w:w="0" w:type="dxa"/>
-            <w:bottom w:w="0" w:type="dxa"/>
-          </w:tblCellMar>
-        </w:tblPrEx>
         <w:tc>
           <w:tcPr>
             <w:tcW w:w="1838" w:type="dxa"/>
@@ -7768,7 +7610,13 @@
       </w:pPr>
       <w:r>
         <w:lastRenderedPageBreak/>
-        <w:t>Eine ausgereifte Projektregel-Datei sieht etwa so aus:</w:t>
+        <w:t xml:space="preserve">Eine ausgereifte </w:t>
+      </w:r>
+      <w:r>
+        <w:t>Constitution</w:t>
+      </w:r>
+      <w:r>
+        <w:t>-Datei sieht etwa so aus:</w:t>
       </w:r>
     </w:p>
     <w:tbl>
@@ -8119,8 +7967,83 @@
                 <w:sz w:val="18"/>
                 <w:szCs w:val="18"/>
               </w:rPr>
-              <w:t>- **Immer:** Annahmen ausschreiben, bevor Code entsteht. Keine stillen</w:t>
-            </w:r>
+              <w:t>- **Immer:** Annahmen ausschreiben, bevor Code entsteht. Keine stillen Entscheidungen.</w:t>
+            </w:r>
+          </w:p>
+          <w:p>
+            <w:pPr>
+              <w:spacing w:after="20"/>
+            </w:pPr>
+            <w:r>
+              <w:rPr>
+                <w:rFonts w:ascii="Consolas" w:eastAsia="Consolas" w:hAnsi="Consolas" w:cs="Consolas"/>
+                <w:color w:val="24292F"/>
+                <w:sz w:val="18"/>
+                <w:szCs w:val="18"/>
+              </w:rPr>
+              <w:t>- **In Spezifikation und Planung:** Bei Mehrdeutigkeit nachfragen. Sind</w:t>
+            </w:r>
+          </w:p>
+          <w:p>
+            <w:pPr>
+              <w:spacing w:after="20"/>
+            </w:pPr>
+            <w:r>
+              <w:rPr>
+                <w:rFonts w:ascii="Consolas" w:eastAsia="Consolas" w:hAnsi="Consolas" w:cs="Consolas"/>
+                <w:color w:val="24292F"/>
+                <w:sz w:val="18"/>
+                <w:szCs w:val="18"/>
+              </w:rPr>
+              <w:t xml:space="preserve">  mehrere Lesarten plausibel, alle nennen - nicht eine auswählen.</w:t>
+            </w:r>
+          </w:p>
+          <w:p>
+            <w:pPr>
+              <w:spacing w:after="20"/>
+            </w:pPr>
+            <w:r>
+              <w:rPr>
+                <w:rFonts w:ascii="Consolas" w:eastAsia="Consolas" w:hAnsi="Consolas" w:cs="Consolas"/>
+                <w:color w:val="24292F"/>
+                <w:sz w:val="18"/>
+                <w:szCs w:val="18"/>
+              </w:rPr>
+              <w:t>- **In der Implementierung:** Keine Rückfragen zu Punkten, die bereits</w:t>
+            </w:r>
+          </w:p>
+          <w:p>
+            <w:pPr>
+              <w:spacing w:after="20"/>
+            </w:pPr>
+            <w:r>
+              <w:rPr>
+                <w:rFonts w:ascii="Consolas" w:eastAsia="Consolas" w:hAnsi="Consolas" w:cs="Consolas"/>
+                <w:color w:val="24292F"/>
+                <w:sz w:val="18"/>
+                <w:szCs w:val="18"/>
+              </w:rPr>
+              <w:t xml:space="preserve">  geklärt sind. Rückfrage nur bei Widerspruch oder echter Lücke.</w:t>
+            </w:r>
+          </w:p>
+          <w:p>
+            <w:pPr>
+              <w:spacing w:after="20"/>
+            </w:pPr>
+            <w:r>
+              <w:rPr>
+                <w:rFonts w:ascii="Consolas" w:eastAsia="Consolas" w:hAnsi="Consolas" w:cs="Consolas"/>
+                <w:color w:val="24292F"/>
+                <w:sz w:val="18"/>
+                <w:szCs w:val="18"/>
+              </w:rPr>
+              <w:t>- Gibt es einen einfacheren Weg als den geplanten: sagen, nicht heimlich umsetzen.</w:t>
+            </w:r>
+          </w:p>
+          <w:p>
+            <w:pPr>
+              <w:spacing w:after="20"/>
+            </w:pPr>
             <w:r>
               <w:rPr>
                 <w:rFonts w:ascii="Consolas" w:eastAsia="Consolas" w:hAnsi="Consolas" w:cs="Consolas"/>
@@ -8130,15 +8053,6 @@
               </w:rPr>
               <w:t xml:space="preserve"> </w:t>
             </w:r>
-            <w:r>
-              <w:rPr>
-                <w:rFonts w:ascii="Consolas" w:eastAsia="Consolas" w:hAnsi="Consolas" w:cs="Consolas"/>
-                <w:color w:val="24292F"/>
-                <w:sz w:val="18"/>
-                <w:szCs w:val="18"/>
-              </w:rPr>
-              <w:t>Entscheidungen.</w:t>
-            </w:r>
           </w:p>
           <w:p>
             <w:pPr>
@@ -8151,7 +8065,7 @@
                 <w:sz w:val="18"/>
                 <w:szCs w:val="18"/>
               </w:rPr>
-              <w:t>- **In Spezifikation und Planung:** Bei Mehrdeutigkeit nachfragen. Sind</w:t>
+              <w:t>---</w:t>
             </w:r>
           </w:p>
           <w:p>
@@ -8165,7 +8079,7 @@
                 <w:sz w:val="18"/>
                 <w:szCs w:val="18"/>
               </w:rPr>
-              <w:t xml:space="preserve">  mehrere Lesarten plausibel, alle nennen - nicht eine auswählen.</w:t>
+              <w:t>## 3. Einfachheit ist der Default</w:t>
             </w:r>
           </w:p>
           <w:p>
@@ -8179,7 +8093,7 @@
                 <w:sz w:val="18"/>
                 <w:szCs w:val="18"/>
               </w:rPr>
-              <w:t>- **In der Implementierung:** Keine Rückfragen zu Punkten, die bereits</w:t>
+              <w:t>- Nur umsetzen, was in `@spec.md` steht. Keine zusätzlichen Features, Optionen.</w:t>
             </w:r>
           </w:p>
           <w:p>
@@ -8193,7 +8107,7 @@
                 <w:sz w:val="18"/>
                 <w:szCs w:val="18"/>
               </w:rPr>
-              <w:t xml:space="preserve">  geklärt sind. Rückfrage nur bei Widerspruch oder echter Lücke.</w:t>
+              <w:t>- Keine Abstraktion für Code mit genau einer Verwendungsstelle.</w:t>
             </w:r>
           </w:p>
           <w:p>
@@ -8207,8 +8121,13 @@
                 <w:sz w:val="18"/>
                 <w:szCs w:val="18"/>
               </w:rPr>
-              <w:t>- Gibt es einen einfacheren Weg als den geplanten: sagen, nicht heimlich</w:t>
-            </w:r>
+              <w:t>- Keine Fehlerbehandlung für Fälle, die die Spezifikation ausschließt.</w:t>
+            </w:r>
+          </w:p>
+          <w:p>
+            <w:pPr>
+              <w:spacing w:after="20"/>
+            </w:pPr>
             <w:r>
               <w:rPr>
                 <w:rFonts w:ascii="Consolas" w:eastAsia="Consolas" w:hAnsi="Consolas" w:cs="Consolas"/>
@@ -8218,15 +8137,6 @@
               </w:rPr>
               <w:t xml:space="preserve"> </w:t>
             </w:r>
-            <w:r>
-              <w:rPr>
-                <w:rFonts w:ascii="Consolas" w:eastAsia="Consolas" w:hAnsi="Consolas" w:cs="Consolas"/>
-                <w:color w:val="24292F"/>
-                <w:sz w:val="18"/>
-                <w:szCs w:val="18"/>
-              </w:rPr>
-              <w:t>umsetzen.</w:t>
-            </w:r>
           </w:p>
           <w:p>
             <w:pPr>
@@ -8239,6 +8149,34 @@
                 <w:sz w:val="18"/>
                 <w:szCs w:val="18"/>
               </w:rPr>
+              <w:t>Diese Defaults gelten, solange `@plan.md` nichts anderes vorschreibt.</w:t>
+            </w:r>
+          </w:p>
+          <w:p>
+            <w:pPr>
+              <w:spacing w:after="20"/>
+            </w:pPr>
+            <w:r>
+              <w:rPr>
+                <w:rFonts w:ascii="Consolas" w:eastAsia="Consolas" w:hAnsi="Consolas" w:cs="Consolas"/>
+                <w:color w:val="24292F"/>
+                <w:sz w:val="18"/>
+                <w:szCs w:val="18"/>
+              </w:rPr>
+              <w:t>`@plan.md` schlägt den Default - aber nur schriftlich.</w:t>
+            </w:r>
+          </w:p>
+          <w:p>
+            <w:pPr>
+              <w:spacing w:after="20"/>
+            </w:pPr>
+            <w:r>
+              <w:rPr>
+                <w:rFonts w:ascii="Consolas" w:eastAsia="Consolas" w:hAnsi="Consolas" w:cs="Consolas"/>
+                <w:color w:val="24292F"/>
+                <w:sz w:val="18"/>
+                <w:szCs w:val="18"/>
+              </w:rPr>
               <w:t xml:space="preserve"> </w:t>
             </w:r>
           </w:p>
@@ -8267,7 +8205,7 @@
                 <w:sz w:val="18"/>
                 <w:szCs w:val="18"/>
               </w:rPr>
-              <w:t>## 3. Einfachheit ist der Default</w:t>
+              <w:t>## 4. Chirurgische Änderungen</w:t>
             </w:r>
           </w:p>
           <w:p>
@@ -8281,8 +8219,125 @@
                 <w:sz w:val="18"/>
                 <w:szCs w:val="18"/>
               </w:rPr>
-              <w:t>- Nur umsetzen, was in `@spec.md` steht. Keine zusätzlichen Features,</w:t>
-            </w:r>
+              <w:t>- Jede geänderte Zeile muss auf **genau eine** benannte Aufgabe</w:t>
+            </w:r>
+          </w:p>
+          <w:p>
+            <w:pPr>
+              <w:spacing w:after="20"/>
+            </w:pPr>
+            <w:r>
+              <w:rPr>
+                <w:rFonts w:ascii="Consolas" w:eastAsia="Consolas" w:hAnsi="Consolas" w:cs="Consolas"/>
+                <w:color w:val="24292F"/>
+                <w:sz w:val="18"/>
+                <w:szCs w:val="18"/>
+              </w:rPr>
+              <w:t xml:space="preserve">  zurückführbar sein. Ist sie das nicht, gehört sie nicht in die Änderung.</w:t>
+            </w:r>
+          </w:p>
+          <w:p>
+            <w:pPr>
+              <w:spacing w:after="20"/>
+            </w:pPr>
+            <w:r>
+              <w:rPr>
+                <w:rFonts w:ascii="Consolas" w:eastAsia="Consolas" w:hAnsi="Consolas" w:cs="Consolas"/>
+                <w:color w:val="24292F"/>
+                <w:sz w:val="18"/>
+                <w:szCs w:val="18"/>
+              </w:rPr>
+              <w:t>- Benachbarten Code nicht „verbessern": keine Umformatierung, keine</w:t>
+            </w:r>
+          </w:p>
+          <w:p>
+            <w:pPr>
+              <w:spacing w:after="20"/>
+            </w:pPr>
+            <w:r>
+              <w:rPr>
+                <w:rFonts w:ascii="Consolas" w:eastAsia="Consolas" w:hAnsi="Consolas" w:cs="Consolas"/>
+                <w:color w:val="24292F"/>
+                <w:sz w:val="18"/>
+                <w:szCs w:val="18"/>
+              </w:rPr>
+              <w:t xml:space="preserve">  Kommentarpflege, kein Refactoring von Funktionierendem.</w:t>
+            </w:r>
+          </w:p>
+          <w:p>
+            <w:pPr>
+              <w:spacing w:after="20"/>
+            </w:pPr>
+            <w:r>
+              <w:rPr>
+                <w:rFonts w:ascii="Consolas" w:eastAsia="Consolas" w:hAnsi="Consolas" w:cs="Consolas"/>
+                <w:color w:val="24292F"/>
+                <w:sz w:val="18"/>
+                <w:szCs w:val="18"/>
+              </w:rPr>
+              <w:t>- Vorhandenen Stil übernehmen, auch wenn ein anderer besser wäre.</w:t>
+            </w:r>
+          </w:p>
+          <w:p>
+            <w:pPr>
+              <w:spacing w:after="20"/>
+            </w:pPr>
+            <w:r>
+              <w:rPr>
+                <w:rFonts w:ascii="Consolas" w:eastAsia="Consolas" w:hAnsi="Consolas" w:cs="Consolas"/>
+                <w:color w:val="24292F"/>
+                <w:sz w:val="18"/>
+                <w:szCs w:val="18"/>
+              </w:rPr>
+              <w:t>- Code, der **vorher schon** tot war: melden, nicht löschen. Importe und</w:t>
+            </w:r>
+          </w:p>
+          <w:p>
+            <w:pPr>
+              <w:spacing w:after="20"/>
+            </w:pPr>
+            <w:r>
+              <w:rPr>
+                <w:rFonts w:ascii="Consolas" w:eastAsia="Consolas" w:hAnsi="Consolas" w:cs="Consolas"/>
+                <w:color w:val="24292F"/>
+                <w:sz w:val="18"/>
+                <w:szCs w:val="18"/>
+              </w:rPr>
+              <w:t xml:space="preserve">  Variablen, die **durch diese Änderung** verwaist sind: entfernen.</w:t>
+            </w:r>
+          </w:p>
+          <w:p>
+            <w:pPr>
+              <w:spacing w:after="20"/>
+            </w:pPr>
+            <w:r>
+              <w:rPr>
+                <w:rFonts w:ascii="Consolas" w:eastAsia="Consolas" w:hAnsi="Consolas" w:cs="Consolas"/>
+                <w:color w:val="24292F"/>
+                <w:sz w:val="18"/>
+                <w:szCs w:val="18"/>
+              </w:rPr>
+              <w:t>- Ausnahme: Automatische Formatierer dürfen angrenzende Zeilen verändern.</w:t>
+            </w:r>
+          </w:p>
+          <w:p>
+            <w:pPr>
+              <w:spacing w:after="20"/>
+            </w:pPr>
+            <w:r>
+              <w:rPr>
+                <w:rFonts w:ascii="Consolas" w:eastAsia="Consolas" w:hAnsi="Consolas" w:cs="Consolas"/>
+                <w:color w:val="24292F"/>
+                <w:sz w:val="18"/>
+                <w:szCs w:val="18"/>
+              </w:rPr>
+              <w:t xml:space="preserve">  Im Bericht erwähnen.</w:t>
+            </w:r>
+          </w:p>
+          <w:p>
+            <w:pPr>
+              <w:spacing w:after="20"/>
+            </w:pPr>
             <w:r>
               <w:rPr>
                 <w:rFonts w:ascii="Consolas" w:eastAsia="Consolas" w:hAnsi="Consolas" w:cs="Consolas"/>
@@ -8292,15 +8347,6 @@
               </w:rPr>
               <w:t xml:space="preserve"> </w:t>
             </w:r>
-            <w:r>
-              <w:rPr>
-                <w:rFonts w:ascii="Consolas" w:eastAsia="Consolas" w:hAnsi="Consolas" w:cs="Consolas"/>
-                <w:color w:val="24292F"/>
-                <w:sz w:val="18"/>
-                <w:szCs w:val="18"/>
-              </w:rPr>
-              <w:t>Optionen.</w:t>
-            </w:r>
           </w:p>
           <w:p>
             <w:pPr>
@@ -8313,7 +8359,7 @@
                 <w:sz w:val="18"/>
                 <w:szCs w:val="18"/>
               </w:rPr>
-              <w:t>- Keine Abstraktion für Code mit genau einer Verwendungsstelle.</w:t>
+              <w:t>---</w:t>
             </w:r>
           </w:p>
           <w:p>
@@ -8327,7 +8373,7 @@
                 <w:sz w:val="18"/>
                 <w:szCs w:val="18"/>
               </w:rPr>
-              <w:t>- Keine Fehlerbehandlung für Fälle, die die Spezifikation ausschließt.</w:t>
+              <w:t>## 5. Verifikation vor Fertigmeldung</w:t>
             </w:r>
           </w:p>
           <w:p>
@@ -8341,6 +8387,48 @@
                 <w:sz w:val="18"/>
                 <w:szCs w:val="18"/>
               </w:rPr>
+              <w:t>- Prüfkriterium **vor** der Umsetzung benennen. „Funktioniert" ist kein Kriterium, „Test X läuft grün" ist eines.</w:t>
+            </w:r>
+          </w:p>
+          <w:p>
+            <w:pPr>
+              <w:spacing w:after="20"/>
+            </w:pPr>
+            <w:r>
+              <w:rPr>
+                <w:rFonts w:ascii="Consolas" w:eastAsia="Consolas" w:hAnsi="Consolas" w:cs="Consolas"/>
+                <w:color w:val="24292F"/>
+                <w:sz w:val="18"/>
+                <w:szCs w:val="18"/>
+              </w:rPr>
+              <w:t>- Fehlerbehebung: erst ein Test, der den Fehler reproduziert, dann dieBehebung.</w:t>
+            </w:r>
+          </w:p>
+          <w:p>
+            <w:pPr>
+              <w:spacing w:after="20"/>
+            </w:pPr>
+            <w:r>
+              <w:rPr>
+                <w:rFonts w:ascii="Consolas" w:eastAsia="Consolas" w:hAnsi="Consolas" w:cs="Consolas"/>
+                <w:color w:val="24292F"/>
+                <w:sz w:val="18"/>
+                <w:szCs w:val="18"/>
+              </w:rPr>
+              <w:t>- Prüfbefehl des Projekts: siehe `@plan.md`.</w:t>
+            </w:r>
+          </w:p>
+          <w:p>
+            <w:pPr>
+              <w:spacing w:after="20"/>
+            </w:pPr>
+            <w:r>
+              <w:rPr>
+                <w:rFonts w:ascii="Consolas" w:eastAsia="Consolas" w:hAnsi="Consolas" w:cs="Consolas"/>
+                <w:color w:val="24292F"/>
+                <w:sz w:val="18"/>
+                <w:szCs w:val="18"/>
+              </w:rPr>
               <w:t xml:space="preserve"> </w:t>
             </w:r>
           </w:p>
@@ -8355,7 +8443,7 @@
                 <w:sz w:val="18"/>
                 <w:szCs w:val="18"/>
               </w:rPr>
-              <w:t>Diese Defaults gelten, solange `@plan.md` nichts anderes vorschreibt.</w:t>
+              <w:t>Jede Task wird mit einer Ampel gemeldet:</w:t>
             </w:r>
           </w:p>
           <w:p>
@@ -8369,7 +8457,7 @@
                 <w:sz w:val="18"/>
                 <w:szCs w:val="18"/>
               </w:rPr>
-              <w:t>`@plan.md` schlägt den Default - aber nur schriftlich.</w:t>
+              <w:t xml:space="preserve">| Bedeutung | </w:t>
             </w:r>
           </w:p>
           <w:p>
@@ -8383,346 +8471,7 @@
                 <w:sz w:val="18"/>
                 <w:szCs w:val="18"/>
               </w:rPr>
-              <w:t xml:space="preserve"> </w:t>
-            </w:r>
-          </w:p>
-          <w:p>
-            <w:pPr>
-              <w:spacing w:after="20"/>
-            </w:pPr>
-            <w:r>
-              <w:rPr>
-                <w:rFonts w:ascii="Consolas" w:eastAsia="Consolas" w:hAnsi="Consolas" w:cs="Consolas"/>
-                <w:color w:val="24292F"/>
-                <w:sz w:val="18"/>
-                <w:szCs w:val="18"/>
-              </w:rPr>
-              <w:t>---</w:t>
-            </w:r>
-          </w:p>
-          <w:p>
-            <w:pPr>
-              <w:spacing w:after="20"/>
-            </w:pPr>
-            <w:r>
-              <w:rPr>
-                <w:rFonts w:ascii="Consolas" w:eastAsia="Consolas" w:hAnsi="Consolas" w:cs="Consolas"/>
-                <w:color w:val="24292F"/>
-                <w:sz w:val="18"/>
-                <w:szCs w:val="18"/>
-              </w:rPr>
-              <w:t>## 4. Chirurgische Änderungen</w:t>
-            </w:r>
-          </w:p>
-          <w:p>
-            <w:pPr>
-              <w:spacing w:after="20"/>
-            </w:pPr>
-            <w:r>
-              <w:rPr>
-                <w:rFonts w:ascii="Consolas" w:eastAsia="Consolas" w:hAnsi="Consolas" w:cs="Consolas"/>
-                <w:color w:val="24292F"/>
-                <w:sz w:val="18"/>
-                <w:szCs w:val="18"/>
-              </w:rPr>
-              <w:t>- Jede geänderte Zeile muss auf **genau eine** benannte Aufgabe</w:t>
-            </w:r>
-          </w:p>
-          <w:p>
-            <w:pPr>
-              <w:spacing w:after="20"/>
-            </w:pPr>
-            <w:r>
-              <w:rPr>
-                <w:rFonts w:ascii="Consolas" w:eastAsia="Consolas" w:hAnsi="Consolas" w:cs="Consolas"/>
-                <w:color w:val="24292F"/>
-                <w:sz w:val="18"/>
-                <w:szCs w:val="18"/>
-              </w:rPr>
-              <w:t xml:space="preserve">  zurückführbar sein. Ist sie das nicht, gehört sie nicht in die Änderung.</w:t>
-            </w:r>
-          </w:p>
-          <w:p>
-            <w:pPr>
-              <w:spacing w:after="20"/>
-            </w:pPr>
-            <w:r>
-              <w:rPr>
-                <w:rFonts w:ascii="Consolas" w:eastAsia="Consolas" w:hAnsi="Consolas" w:cs="Consolas"/>
-                <w:color w:val="24292F"/>
-                <w:sz w:val="18"/>
-                <w:szCs w:val="18"/>
-              </w:rPr>
-              <w:t>- Benachbarten Code nicht „verbessern": keine Umformatierung, keine</w:t>
-            </w:r>
-          </w:p>
-          <w:p>
-            <w:pPr>
-              <w:spacing w:after="20"/>
-            </w:pPr>
-            <w:r>
-              <w:rPr>
-                <w:rFonts w:ascii="Consolas" w:eastAsia="Consolas" w:hAnsi="Consolas" w:cs="Consolas"/>
-                <w:color w:val="24292F"/>
-                <w:sz w:val="18"/>
-                <w:szCs w:val="18"/>
-              </w:rPr>
-              <w:t xml:space="preserve">  Kommentarpflege, kein Refactoring von Funktionierendem.</w:t>
-            </w:r>
-          </w:p>
-          <w:p>
-            <w:pPr>
-              <w:spacing w:after="20"/>
-            </w:pPr>
-            <w:r>
-              <w:rPr>
-                <w:rFonts w:ascii="Consolas" w:eastAsia="Consolas" w:hAnsi="Consolas" w:cs="Consolas"/>
-                <w:color w:val="24292F"/>
-                <w:sz w:val="18"/>
-                <w:szCs w:val="18"/>
-              </w:rPr>
-              <w:t>- Vorhandenen Stil übernehmen, auch wenn ein anderer besser wäre.</w:t>
-            </w:r>
-          </w:p>
-          <w:p>
-            <w:pPr>
-              <w:spacing w:after="20"/>
-            </w:pPr>
-            <w:r>
-              <w:rPr>
-                <w:rFonts w:ascii="Consolas" w:eastAsia="Consolas" w:hAnsi="Consolas" w:cs="Consolas"/>
-                <w:color w:val="24292F"/>
-                <w:sz w:val="18"/>
-                <w:szCs w:val="18"/>
-              </w:rPr>
-              <w:t>- Code, der **vorher schon** tot war: melden, nicht löschen. Importe und</w:t>
-            </w:r>
-          </w:p>
-          <w:p>
-            <w:pPr>
-              <w:spacing w:after="20"/>
-            </w:pPr>
-            <w:r>
-              <w:rPr>
-                <w:rFonts w:ascii="Consolas" w:eastAsia="Consolas" w:hAnsi="Consolas" w:cs="Consolas"/>
-                <w:color w:val="24292F"/>
-                <w:sz w:val="18"/>
-                <w:szCs w:val="18"/>
-              </w:rPr>
-              <w:t xml:space="preserve">  Variablen, die **durch diese Änderung** verwaist sind: entfernen.</w:t>
-            </w:r>
-          </w:p>
-          <w:p>
-            <w:pPr>
-              <w:spacing w:after="20"/>
-            </w:pPr>
-            <w:r>
-              <w:rPr>
-                <w:rFonts w:ascii="Consolas" w:eastAsia="Consolas" w:hAnsi="Consolas" w:cs="Consolas"/>
-                <w:color w:val="24292F"/>
-                <w:sz w:val="18"/>
-                <w:szCs w:val="18"/>
-              </w:rPr>
-              <w:t>- Ausnahme: Automatische Formatierer dürfen angrenzende Zeilen verändern.</w:t>
-            </w:r>
-          </w:p>
-          <w:p>
-            <w:pPr>
-              <w:spacing w:after="20"/>
-            </w:pPr>
-            <w:r>
-              <w:rPr>
-                <w:rFonts w:ascii="Consolas" w:eastAsia="Consolas" w:hAnsi="Consolas" w:cs="Consolas"/>
-                <w:color w:val="24292F"/>
-                <w:sz w:val="18"/>
-                <w:szCs w:val="18"/>
-              </w:rPr>
-              <w:t xml:space="preserve">  Im Bericht erwähnen.</w:t>
-            </w:r>
-          </w:p>
-          <w:p>
-            <w:pPr>
-              <w:spacing w:after="20"/>
-            </w:pPr>
-            <w:r>
-              <w:rPr>
-                <w:rFonts w:ascii="Consolas" w:eastAsia="Consolas" w:hAnsi="Consolas" w:cs="Consolas"/>
-                <w:color w:val="24292F"/>
-                <w:sz w:val="18"/>
-                <w:szCs w:val="18"/>
-              </w:rPr>
-              <w:t xml:space="preserve"> </w:t>
-            </w:r>
-          </w:p>
-          <w:p>
-            <w:pPr>
-              <w:spacing w:after="20"/>
-            </w:pPr>
-            <w:r>
-              <w:rPr>
-                <w:rFonts w:ascii="Consolas" w:eastAsia="Consolas" w:hAnsi="Consolas" w:cs="Consolas"/>
-                <w:color w:val="24292F"/>
-                <w:sz w:val="18"/>
-                <w:szCs w:val="18"/>
-              </w:rPr>
-              <w:t>---</w:t>
-            </w:r>
-          </w:p>
-          <w:p>
-            <w:pPr>
-              <w:spacing w:after="20"/>
-            </w:pPr>
-            <w:r>
-              <w:rPr>
-                <w:rFonts w:ascii="Consolas" w:eastAsia="Consolas" w:hAnsi="Consolas" w:cs="Consolas"/>
-                <w:color w:val="24292F"/>
-                <w:sz w:val="18"/>
-                <w:szCs w:val="18"/>
-              </w:rPr>
-              <w:t>## 5. Verifikation vor Fertigmeldung</w:t>
-            </w:r>
-          </w:p>
-          <w:p>
-            <w:pPr>
-              <w:spacing w:after="20"/>
-            </w:pPr>
-            <w:r>
-              <w:rPr>
-                <w:rFonts w:ascii="Consolas" w:eastAsia="Consolas" w:hAnsi="Consolas" w:cs="Consolas"/>
-                <w:color w:val="24292F"/>
-                <w:sz w:val="18"/>
-                <w:szCs w:val="18"/>
-              </w:rPr>
-              <w:t>- Prüfkriterium **vor** der Umsetzung benennen. „Funktioniert" ist kein</w:t>
-            </w:r>
-            <w:r>
-              <w:rPr>
-                <w:rFonts w:ascii="Consolas" w:eastAsia="Consolas" w:hAnsi="Consolas" w:cs="Consolas"/>
-                <w:color w:val="24292F"/>
-                <w:sz w:val="18"/>
-                <w:szCs w:val="18"/>
-              </w:rPr>
-              <w:t xml:space="preserve"> </w:t>
-            </w:r>
-            <w:r>
-              <w:rPr>
-                <w:rFonts w:ascii="Consolas" w:eastAsia="Consolas" w:hAnsi="Consolas" w:cs="Consolas"/>
-                <w:color w:val="24292F"/>
-                <w:sz w:val="18"/>
-                <w:szCs w:val="18"/>
-              </w:rPr>
-              <w:t>Kriterium, „Test X läuft grün" ist eines.</w:t>
-            </w:r>
-          </w:p>
-          <w:p>
-            <w:pPr>
-              <w:spacing w:after="20"/>
-            </w:pPr>
-            <w:r>
-              <w:rPr>
-                <w:rFonts w:ascii="Consolas" w:eastAsia="Consolas" w:hAnsi="Consolas" w:cs="Consolas"/>
-                <w:color w:val="24292F"/>
-                <w:sz w:val="18"/>
-                <w:szCs w:val="18"/>
-              </w:rPr>
-              <w:t>- Fehlerbehebung: erst ein Test, der den Fehler reproduziert, dann dieBehebung.</w:t>
-            </w:r>
-          </w:p>
-          <w:p>
-            <w:pPr>
-              <w:spacing w:after="20"/>
-            </w:pPr>
-            <w:r>
-              <w:rPr>
-                <w:rFonts w:ascii="Consolas" w:eastAsia="Consolas" w:hAnsi="Consolas" w:cs="Consolas"/>
-                <w:color w:val="24292F"/>
-                <w:sz w:val="18"/>
-                <w:szCs w:val="18"/>
-              </w:rPr>
-              <w:t>- Prüfbefehl des Projekts: siehe `@plan.md`.</w:t>
-            </w:r>
-          </w:p>
-          <w:p>
-            <w:pPr>
-              <w:spacing w:after="20"/>
-            </w:pPr>
-            <w:r>
-              <w:rPr>
-                <w:rFonts w:ascii="Consolas" w:eastAsia="Consolas" w:hAnsi="Consolas" w:cs="Consolas"/>
-                <w:color w:val="24292F"/>
-                <w:sz w:val="18"/>
-                <w:szCs w:val="18"/>
-              </w:rPr>
-              <w:t xml:space="preserve"> </w:t>
-            </w:r>
-          </w:p>
-          <w:p>
-            <w:pPr>
-              <w:spacing w:after="20"/>
-            </w:pPr>
-            <w:r>
-              <w:rPr>
-                <w:rFonts w:ascii="Consolas" w:eastAsia="Consolas" w:hAnsi="Consolas" w:cs="Consolas"/>
-                <w:color w:val="24292F"/>
-                <w:sz w:val="18"/>
-                <w:szCs w:val="18"/>
-              </w:rPr>
-              <w:t>Jede Task wird mit einer Ampel gemeldet:</w:t>
-            </w:r>
-          </w:p>
-          <w:p>
-            <w:pPr>
-              <w:spacing w:after="20"/>
-            </w:pPr>
-            <w:r>
-              <w:rPr>
-                <w:rFonts w:ascii="Consolas" w:eastAsia="Consolas" w:hAnsi="Consolas" w:cs="Consolas"/>
-                <w:color w:val="24292F"/>
-                <w:sz w:val="18"/>
-                <w:szCs w:val="18"/>
-              </w:rPr>
-              <w:t>| Bedeutung |</w:t>
-            </w:r>
-            <w:r>
-              <w:rPr>
-                <w:rFonts w:ascii="Consolas" w:eastAsia="Consolas" w:hAnsi="Consolas" w:cs="Consolas"/>
-                <w:color w:val="24292F"/>
-                <w:sz w:val="18"/>
-                <w:szCs w:val="18"/>
-              </w:rPr>
-              <w:t xml:space="preserve"> </w:t>
-            </w:r>
-          </w:p>
-          <w:p>
-            <w:pPr>
-              <w:spacing w:after="20"/>
-            </w:pPr>
-            <w:r>
-              <w:rPr>
-                <w:rFonts w:ascii="Consolas" w:eastAsia="Consolas" w:hAnsi="Consolas" w:cs="Consolas"/>
-                <w:color w:val="24292F"/>
-                <w:sz w:val="18"/>
-                <w:szCs w:val="18"/>
-              </w:rPr>
-              <w:t xml:space="preserve">| **GRÜN** </w:t>
-            </w:r>
-            <w:r>
-              <w:rPr>
-                <w:rFonts w:ascii="Consolas" w:eastAsia="Consolas" w:hAnsi="Consolas" w:cs="Consolas"/>
-                <w:color w:val="24292F"/>
-                <w:sz w:val="18"/>
-                <w:szCs w:val="18"/>
-              </w:rPr>
-              <w:t xml:space="preserve"> </w:t>
-            </w:r>
-            <w:r>
-              <w:rPr>
-                <w:rFonts w:ascii="Consolas" w:eastAsia="Consolas" w:hAnsi="Consolas" w:cs="Consolas"/>
-                <w:color w:val="24292F"/>
-                <w:sz w:val="18"/>
-                <w:szCs w:val="18"/>
-              </w:rPr>
-              <w:t>| Kriterium erfüllt und nachgewiesen.</w:t>
+              <w:t>| **GRÜN**  | Kriterium erfüllt und nachgewiesen.</w:t>
             </w:r>
           </w:p>
           <w:p>
@@ -8779,25 +8528,7 @@
                 <w:sz w:val="18"/>
                 <w:szCs w:val="18"/>
               </w:rPr>
-              <w:t>Nach drei erfolglosen Korrekturversuchen an derselben Task: abbrechen und</w:t>
-            </w:r>
-            <w:r>
-              <w:rPr>
-                <w:rFonts w:ascii="Consolas" w:eastAsia="Consolas" w:hAnsi="Consolas" w:cs="Consolas"/>
-                <w:color w:val="24292F"/>
-                <w:sz w:val="18"/>
-                <w:szCs w:val="18"/>
-              </w:rPr>
-              <w:t xml:space="preserve"> </w:t>
-            </w:r>
-            <w:r>
-              <w:rPr>
-                <w:rFonts w:ascii="Consolas" w:eastAsia="Consolas" w:hAnsi="Consolas" w:cs="Consolas"/>
-                <w:color w:val="24292F"/>
-                <w:sz w:val="18"/>
-                <w:szCs w:val="18"/>
-              </w:rPr>
-              <w:t>ROT melden. Nicht weiter probieren.</w:t>
+              <w:t>Nach drei erfolglosen Korrekturversuchen an derselben Task: abbrechen und ROT melden. Nicht weiter probieren.</w:t>
             </w:r>
           </w:p>
           <w:p>
@@ -10746,19 +10477,11 @@
           <w:p>
             <w:pPr>
               <w:spacing w:after="60" w:line="264" w:lineRule="auto"/>
-            </w:pPr>
-            <w:r>
               <w:rPr>
                 <w:i/>
                 <w:iCs/>
                 <w:color w:val="2B2F36"/>
               </w:rPr>
-              <w:t>Implementiere jetzt den Code, bis alle Tests grün sind. Halte dich strikt an die</w:t>
-            </w:r>
-          </w:p>
-          <w:p>
-            <w:pPr>
-              <w:spacing w:after="60" w:line="264" w:lineRule="auto"/>
             </w:pPr>
             <w:r>
               <w:rPr>
@@ -10766,33 +10489,38 @@
                 <w:iCs/>
                 <w:color w:val="2B2F36"/>
               </w:rPr>
-              <w:t>Constraints in @spec.md Abschnitt 5 (Python, FastAPI, scikit-learn IsolationForest,</w:t>
-            </w:r>
-          </w:p>
-          <w:p>
-            <w:pPr>
-              <w:spacing w:after="60" w:line="264" w:lineRule="auto"/>
-            </w:pPr>
+              <w:t>Implementiere jetzt den Code, bis alle Tests grün sind. Halte dich strikt an die</w:t>
+            </w:r>
             <w:r>
               <w:rPr>
                 <w:i/>
                 <w:iCs/>
                 <w:color w:val="2B2F36"/>
               </w:rPr>
-              <w:t>SQLite). Führe die Tests aus und zeig mir das Ergebnis. Schlagen Tests fehl,</w:t>
-            </w:r>
-          </w:p>
-          <w:p>
-            <w:pPr>
-              <w:spacing w:after="60" w:line="264" w:lineRule="auto"/>
-            </w:pPr>
+              <w:t xml:space="preserve"> </w:t>
+            </w:r>
             <w:r>
               <w:rPr>
                 <w:i/>
                 <w:iCs/>
                 <w:color w:val="2B2F36"/>
               </w:rPr>
-              <w:lastRenderedPageBreak/>
+              <w:t>Constraints in @spec.md. Führe die Tests aus und zeig mir das Ergebnis. Schlagen Tests fehl,</w:t>
+            </w:r>
+            <w:r>
+              <w:rPr>
+                <w:i/>
+                <w:iCs/>
+                <w:color w:val="2B2F36"/>
+              </w:rPr>
+              <w:t xml:space="preserve"> </w:t>
+            </w:r>
+            <w:r>
+              <w:rPr>
+                <w:i/>
+                <w:iCs/>
+                <w:color w:val="2B2F36"/>
+              </w:rPr>
               <w:t>korrigiere und wiederhole.</w:t>
             </w:r>
           </w:p>
@@ -10809,6 +10537,7 @@
         <w:spacing w:after="120" w:line="276" w:lineRule="auto"/>
       </w:pPr>
       <w:r>
+        <w:lastRenderedPageBreak/>
         <w:t>Der Agent führt nun selbst die Schleife „Test ausführen → Fehler lesen → Code anpassen“ aus. Lass ihn iterieren, aber sieh dir die Diffs an.</w:t>
       </w:r>
     </w:p>
@@ -10921,24 +10650,6 @@
     </w:p>
     <w:p>
       <w:pPr>
-        <w:spacing w:after="120" w:line="276" w:lineRule="auto"/>
-      </w:pPr>
-      <w:r>
-        <w:t xml:space="preserve">Prototyp starten und im Browser ansehen — die wichtigsten Befehle stehen im Abschnitt „Nützliche Befehle“ der </w:t>
-      </w:r>
-      <w:r>
-        <w:rPr>
-          <w:rFonts w:ascii="Consolas" w:eastAsia="Consolas" w:hAnsi="Consolas" w:cs="Consolas"/>
-          <w:color w:val="9C2D2D"/>
-        </w:rPr>
-        <w:t>CLAUDE.md</w:t>
-      </w:r>
-      <w:r>
-        <w:t xml:space="preserve"> (Schritt 2).</w:t>
-      </w:r>
-    </w:p>
-    <w:p>
-      <w:pPr>
         <w:pStyle w:val="Heading2"/>
       </w:pPr>
       <w:bookmarkStart w:id="20" w:name="_Toc238032416"/>
@@ -10964,180 +10675,12 @@
       <w:r>
         <w:t xml:space="preserve"> ab.</w:t>
       </w:r>
-    </w:p>
-    <w:tbl>
-      <w:tblPr>
-        <w:tblW w:w="10171" w:type="dxa"/>
-        <w:tblBorders>
-          <w:top w:val="single" w:sz="4" w:space="0" w:color="auto"/>
-          <w:left w:val="single" w:sz="4" w:space="0" w:color="auto"/>
-          <w:bottom w:val="single" w:sz="4" w:space="0" w:color="auto"/>
-          <w:right w:val="single" w:sz="4" w:space="0" w:color="auto"/>
-          <w:insideH w:val="single" w:sz="4" w:space="0" w:color="auto"/>
-          <w:insideV w:val="single" w:sz="4" w:space="0" w:color="auto"/>
-        </w:tblBorders>
-        <w:tblCellMar>
-          <w:left w:w="10" w:type="dxa"/>
-          <w:right w:w="10" w:type="dxa"/>
-        </w:tblCellMar>
-        <w:tblLook w:val="04A0" w:firstRow="1" w:lastRow="0" w:firstColumn="1" w:lastColumn="0" w:noHBand="0" w:noVBand="1"/>
-      </w:tblPr>
-      <w:tblGrid>
-        <w:gridCol w:w="10171"/>
-      </w:tblGrid>
-      <w:tr>
-        <w:tc>
-          <w:tcPr>
-            <w:tcW w:w="10171" w:type="dxa"/>
-            <w:tcBorders>
-              <w:left w:val="single" w:sz="28" w:space="0" w:color="2E7D32"/>
-            </w:tcBorders>
-            <w:shd w:val="clear" w:color="auto" w:fill="E8F3E8"/>
-            <w:tcMar>
-              <w:top w:w="140" w:type="dxa"/>
-              <w:left w:w="220" w:type="dxa"/>
-              <w:bottom w:w="140" w:type="dxa"/>
-              <w:right w:w="200" w:type="dxa"/>
-            </w:tcMar>
-          </w:tcPr>
-          <w:p>
-            <w:pPr>
-              <w:spacing w:after="80"/>
-            </w:pPr>
-            <w:r>
-              <w:rPr>
-                <w:b/>
-                <w:bCs/>
-                <w:color w:val="256528"/>
-              </w:rPr>
-              <w:t>Die wichtigste Gewohnheit</w:t>
-            </w:r>
-          </w:p>
-          <w:p>
-            <w:pPr>
-              <w:spacing w:line="276" w:lineRule="auto"/>
-            </w:pPr>
-            <w:r>
-              <w:t xml:space="preserve">Neue Wünsche oder gefundene Fehler kommen ZUERST in </w:t>
-            </w:r>
-            <w:r>
-              <w:rPr>
-                <w:rFonts w:ascii="Consolas" w:eastAsia="Consolas" w:hAnsi="Consolas" w:cs="Consolas"/>
-                <w:color w:val="9C2D2D"/>
-              </w:rPr>
-              <w:t>spec.md</w:t>
-            </w:r>
-            <w:r>
-              <w:t xml:space="preserve"> — nie als formloser Zuruf an den Code. Erst danach lässt du den Agenten anpassen. Sonst entsteht „Spec-Drift“: Code und Spezifikation laufen auseinander.</w:t>
-            </w:r>
-          </w:p>
-        </w:tc>
-      </w:tr>
-    </w:tbl>
-    <w:p>
-      <w:pPr>
-        <w:spacing w:line="120" w:lineRule="auto"/>
-      </w:pPr>
-    </w:p>
-    <w:p>
-      <w:pPr>
-        <w:spacing w:after="120" w:line="276" w:lineRule="auto"/>
-      </w:pPr>
-      <w:r>
-        <w:t xml:space="preserve">Beispiel: Der Industriemeister möchte zusätzlich die Maschinen-ID im Titel sehen. Du ergänzt das in </w:t>
-      </w:r>
-      <w:r>
-        <w:rPr>
-          <w:rFonts w:ascii="Consolas" w:eastAsia="Consolas" w:hAnsi="Consolas" w:cs="Consolas"/>
-          <w:color w:val="9C2D2D"/>
-        </w:rPr>
-        <w:t>spec.md</w:t>
-      </w:r>
-      <w:r>
-        <w:t xml:space="preserve"> (Abschnitt 3) und promptest dann:</w:t>
-      </w:r>
-    </w:p>
-    <w:tbl>
-      <w:tblPr>
-        <w:tblW w:w="10171" w:type="dxa"/>
-        <w:tblBorders>
-          <w:top w:val="single" w:sz="4" w:space="0" w:color="auto"/>
-          <w:left w:val="single" w:sz="4" w:space="0" w:color="auto"/>
-          <w:bottom w:val="single" w:sz="4" w:space="0" w:color="auto"/>
-          <w:right w:val="single" w:sz="4" w:space="0" w:color="auto"/>
-          <w:insideH w:val="single" w:sz="4" w:space="0" w:color="auto"/>
-          <w:insideV w:val="single" w:sz="4" w:space="0" w:color="auto"/>
-        </w:tblBorders>
-        <w:tblCellMar>
-          <w:left w:w="10" w:type="dxa"/>
-          <w:right w:w="10" w:type="dxa"/>
-        </w:tblCellMar>
-        <w:tblLook w:val="04A0" w:firstRow="1" w:lastRow="0" w:firstColumn="1" w:lastColumn="0" w:noHBand="0" w:noVBand="1"/>
-      </w:tblPr>
-      <w:tblGrid>
-        <w:gridCol w:w="10171"/>
-      </w:tblGrid>
-      <w:tr>
-        <w:tc>
-          <w:tcPr>
-            <w:tcW w:w="10171" w:type="dxa"/>
-            <w:tcBorders>
-              <w:left w:val="single" w:sz="28" w:space="0" w:color="8A93A0"/>
-            </w:tcBorders>
-            <w:shd w:val="clear" w:color="auto" w:fill="F4F5F7"/>
-            <w:tcMar>
-              <w:top w:w="130" w:type="dxa"/>
-              <w:left w:w="220" w:type="dxa"/>
-              <w:bottom w:w="130" w:type="dxa"/>
-              <w:right w:w="200" w:type="dxa"/>
-            </w:tcMar>
-          </w:tcPr>
-          <w:p>
-            <w:pPr>
-              <w:spacing w:after="80"/>
-            </w:pPr>
-            <w:r>
-              <w:rPr>
-                <w:b/>
-                <w:bCs/>
-                <w:color w:val="55606B"/>
-              </w:rPr>
-              <w:t>Prompt-Beispiel</w:t>
-            </w:r>
-          </w:p>
-          <w:p>
-            <w:pPr>
-              <w:spacing w:after="60" w:line="264" w:lineRule="auto"/>
-            </w:pPr>
-            <w:r>
-              <w:rPr>
-                <w:i/>
-                <w:iCs/>
-                <w:color w:val="2B2F36"/>
-              </w:rPr>
-              <w:t>@spec.md wurde geändert (Abschnitt 3: Maschinen-ID im Titel der Web-Oberfläche).</w:t>
-            </w:r>
-          </w:p>
-          <w:p>
-            <w:pPr>
-              <w:spacing w:after="60" w:line="264" w:lineRule="auto"/>
-            </w:pPr>
-            <w:r>
-              <w:rPr>
-                <w:i/>
-                <w:iCs/>
-                <w:color w:val="2B2F36"/>
-              </w:rPr>
-              <w:t>Passe Implementierung UND Tests entsprechend an und führe die Tests aus.</w:t>
-            </w:r>
-          </w:p>
-        </w:tc>
-      </w:tr>
-    </w:tbl>
-    <w:p>
-      <w:pPr>
-        <w:spacing w:line="120" w:lineRule="auto"/>
-      </w:pPr>
+      <w:r>
+        <w:t xml:space="preserve"> </w:t>
+      </w:r>
+      <w:r>
+        <w:t>Neue Wünsche oder gefundene Fehler kommen ZUERST in spec.md — nie als formloser Zuruf an den Code. Erst danach lässt du den Agenten anpassen. Sonst entsteht „Spec-Drift“: Code und Spezifikation laufen auseinander.</w:t>
+      </w:r>
     </w:p>
     <w:p>
       <w:pPr>
@@ -11615,7 +11158,6 @@
           <w:b/>
           <w:bCs/>
         </w:rPr>
-        <w:lastRenderedPageBreak/>
         <w:t>Kontext überladen.</w:t>
       </w:r>
       <w:r>
@@ -11705,32 +11247,9 @@
         <w:spacing w:after="90" w:line="268" w:lineRule="auto"/>
       </w:pPr>
       <w:r>
-        <w:t xml:space="preserve">Continue — Dokumentation: </w:t>
+        <w:t xml:space="preserve">GitHub Spec Kit (optionales SDD-Toolkit mit /specify, /plan, /tasks): </w:t>
       </w:r>
       <w:hyperlink r:id="rId11" w:history="1">
-        <w:r>
-          <w:rPr>
-            <w:rStyle w:val="Hyperlink"/>
-            <w:sz w:val="21"/>
-            <w:szCs w:val="21"/>
-          </w:rPr>
-          <w:t>https://docs.continue.dev</w:t>
-        </w:r>
-      </w:hyperlink>
-    </w:p>
-    <w:p>
-      <w:pPr>
-        <w:pStyle w:val="ListParagraph"/>
-        <w:numPr>
-          <w:ilvl w:val="0"/>
-          <w:numId w:val="3"/>
-        </w:numPr>
-        <w:spacing w:after="90" w:line="268" w:lineRule="auto"/>
-      </w:pPr>
-      <w:r>
-        <w:t xml:space="preserve">GitHub Spec Kit (optionales SDD-Toolkit mit /specify, /plan, /tasks): </w:t>
-      </w:r>
-      <w:hyperlink r:id="rId12" w:history="1">
         <w:r>
           <w:rPr>
             <w:rStyle w:val="Hyperlink"/>
@@ -11741,8 +11260,24 @@
         </w:r>
       </w:hyperlink>
     </w:p>
+    <w:p>
+      <w:pPr>
+        <w:pStyle w:val="ListParagraph"/>
+        <w:numPr>
+          <w:ilvl w:val="0"/>
+          <w:numId w:val="3"/>
+        </w:numPr>
+        <w:spacing w:after="90" w:line="268" w:lineRule="auto"/>
+      </w:pPr>
+      <w:r>
+        <w:t xml:space="preserve">Constitution-Entwurf: </w:t>
+      </w:r>
+      <w:r>
+        <w:t>https://github.com/multica-ai/andrej-karpathy-skills/tree/main</w:t>
+      </w:r>
+    </w:p>
     <w:sectPr>
-      <w:footerReference w:type="default" r:id="rId13"/>
+      <w:footerReference w:type="default" r:id="rId12"/>
       <w:pgSz w:w="11906" w:h="16838"/>
       <w:pgMar w:top="720" w:right="720" w:bottom="720" w:left="720" w:header="708" w:footer="708" w:gutter="0"/>
       <w:cols w:space="720"/>
@@ -13331,6 +12866,18 @@
       <w:ind w:left="280"/>
     </w:pPr>
   </w:style>
+  <w:style w:type="character" w:styleId="FollowedHyperlink">
+    <w:name w:val="FollowedHyperlink"/>
+    <w:basedOn w:val="DefaultParagraphFont"/>
+    <w:uiPriority w:val="99"/>
+    <w:semiHidden/>
+    <w:unhideWhenUsed/>
+    <w:rsid w:val="00074511"/>
+    <w:rPr>
+      <w:color w:val="96607D" w:themeColor="followedHyperlink"/>
+      <w:u w:val="single"/>
+    </w:rPr>
+  </w:style>
 </w:styles>
 </file>
 

</xml_diff>

<commit_message>
modified:   06_SDLC/SDD_Unterlagen/SDD-Handreichung.docx 	new file:   06_SDLC/SDD_Unterlagen/SDD-Handreichung.pdf
</commit_message>
<xml_diff>
--- a/06_SDLC/SDD_Unterlagen/SDD-Handreichung.docx
+++ b/06_SDLC/SDD_Unterlagen/SDD-Handreichung.docx
@@ -169,7 +169,7 @@
           <w:r>
             <w:fldChar w:fldCharType="separate"/>
           </w:r>
-          <w:hyperlink w:anchor="_Toc238032396" w:history="1">
+          <w:hyperlink w:anchor="_Toc238034307" w:history="1">
             <w:r>
               <w:rPr>
                 <w:rStyle w:val="Hyperlink"/>
@@ -193,7 +193,7 @@
               <w:rPr>
                 <w:noProof/>
               </w:rPr>
-              <w:instrText xml:space="preserve"> PAGEREF _Toc238032396 \h </w:instrText>
+              <w:instrText xml:space="preserve"> PAGEREF _Toc238034307 \h </w:instrText>
             </w:r>
             <w:r>
               <w:rPr>
@@ -236,7 +236,7 @@
               <w14:ligatures w14:val="standardContextual"/>
             </w:rPr>
           </w:pPr>
-          <w:hyperlink w:anchor="_Toc238032397" w:history="1">
+          <w:hyperlink w:anchor="_Toc238034308" w:history="1">
             <w:r>
               <w:rPr>
                 <w:rStyle w:val="Hyperlink"/>
@@ -260,7 +260,7 @@
               <w:rPr>
                 <w:noProof/>
               </w:rPr>
-              <w:instrText xml:space="preserve"> PAGEREF _Toc238032397 \h </w:instrText>
+              <w:instrText xml:space="preserve"> PAGEREF _Toc238034308 \h </w:instrText>
             </w:r>
             <w:r>
               <w:rPr>
@@ -303,7 +303,7 @@
               <w14:ligatures w14:val="standardContextual"/>
             </w:rPr>
           </w:pPr>
-          <w:hyperlink w:anchor="_Toc238032398" w:history="1">
+          <w:hyperlink w:anchor="_Toc238034309" w:history="1">
             <w:r>
               <w:rPr>
                 <w:rStyle w:val="Hyperlink"/>
@@ -327,7 +327,7 @@
               <w:rPr>
                 <w:noProof/>
               </w:rPr>
-              <w:instrText xml:space="preserve"> PAGEREF _Toc238032398 \h </w:instrText>
+              <w:instrText xml:space="preserve"> PAGEREF _Toc238034309 \h </w:instrText>
             </w:r>
             <w:r>
               <w:rPr>
@@ -370,7 +370,7 @@
               <w14:ligatures w14:val="standardContextual"/>
             </w:rPr>
           </w:pPr>
-          <w:hyperlink w:anchor="_Toc238032399" w:history="1">
+          <w:hyperlink w:anchor="_Toc238034310" w:history="1">
             <w:r>
               <w:rPr>
                 <w:rStyle w:val="Hyperlink"/>
@@ -394,7 +394,7 @@
               <w:rPr>
                 <w:noProof/>
               </w:rPr>
-              <w:instrText xml:space="preserve"> PAGEREF _Toc238032399 \h </w:instrText>
+              <w:instrText xml:space="preserve"> PAGEREF _Toc238034310 \h </w:instrText>
             </w:r>
             <w:r>
               <w:rPr>
@@ -437,7 +437,7 @@
               <w14:ligatures w14:val="standardContextual"/>
             </w:rPr>
           </w:pPr>
-          <w:hyperlink w:anchor="_Toc238032400" w:history="1">
+          <w:hyperlink w:anchor="_Toc238034311" w:history="1">
             <w:r>
               <w:rPr>
                 <w:rStyle w:val="Hyperlink"/>
@@ -461,7 +461,7 @@
               <w:rPr>
                 <w:noProof/>
               </w:rPr>
-              <w:instrText xml:space="preserve"> PAGEREF _Toc238032400 \h </w:instrText>
+              <w:instrText xml:space="preserve"> PAGEREF _Toc238034311 \h </w:instrText>
             </w:r>
             <w:r>
               <w:rPr>
@@ -504,7 +504,7 @@
               <w14:ligatures w14:val="standardContextual"/>
             </w:rPr>
           </w:pPr>
-          <w:hyperlink w:anchor="_Toc238032401" w:history="1">
+          <w:hyperlink w:anchor="_Toc238034312" w:history="1">
             <w:r>
               <w:rPr>
                 <w:rStyle w:val="Hyperlink"/>
@@ -528,7 +528,7 @@
               <w:rPr>
                 <w:noProof/>
               </w:rPr>
-              <w:instrText xml:space="preserve"> PAGEREF _Toc238032401 \h </w:instrText>
+              <w:instrText xml:space="preserve"> PAGEREF _Toc238034312 \h </w:instrText>
             </w:r>
             <w:r>
               <w:rPr>
@@ -571,7 +571,7 @@
               <w14:ligatures w14:val="standardContextual"/>
             </w:rPr>
           </w:pPr>
-          <w:hyperlink w:anchor="_Toc238032402" w:history="1">
+          <w:hyperlink w:anchor="_Toc238034313" w:history="1">
             <w:r>
               <w:rPr>
                 <w:rStyle w:val="Hyperlink"/>
@@ -595,7 +595,7 @@
               <w:rPr>
                 <w:noProof/>
               </w:rPr>
-              <w:instrText xml:space="preserve"> PAGEREF _Toc238032402 \h </w:instrText>
+              <w:instrText xml:space="preserve"> PAGEREF _Toc238034313 \h </w:instrText>
             </w:r>
             <w:r>
               <w:rPr>
@@ -638,7 +638,7 @@
               <w14:ligatures w14:val="standardContextual"/>
             </w:rPr>
           </w:pPr>
-          <w:hyperlink w:anchor="_Toc238032403" w:history="1">
+          <w:hyperlink w:anchor="_Toc238034314" w:history="1">
             <w:r>
               <w:rPr>
                 <w:rStyle w:val="Hyperlink"/>
@@ -662,7 +662,7 @@
               <w:rPr>
                 <w:noProof/>
               </w:rPr>
-              <w:instrText xml:space="preserve"> PAGEREF _Toc238032403 \h </w:instrText>
+              <w:instrText xml:space="preserve"> PAGEREF _Toc238034314 \h </w:instrText>
             </w:r>
             <w:r>
               <w:rPr>
@@ -705,7 +705,7 @@
               <w14:ligatures w14:val="standardContextual"/>
             </w:rPr>
           </w:pPr>
-          <w:hyperlink w:anchor="_Toc238032404" w:history="1">
+          <w:hyperlink w:anchor="_Toc238034315" w:history="1">
             <w:r>
               <w:rPr>
                 <w:rStyle w:val="Hyperlink"/>
@@ -729,7 +729,7 @@
               <w:rPr>
                 <w:noProof/>
               </w:rPr>
-              <w:instrText xml:space="preserve"> PAGEREF _Toc238032404 \h </w:instrText>
+              <w:instrText xml:space="preserve"> PAGEREF _Toc238034315 \h </w:instrText>
             </w:r>
             <w:r>
               <w:rPr>
@@ -772,7 +772,7 @@
               <w14:ligatures w14:val="standardContextual"/>
             </w:rPr>
           </w:pPr>
-          <w:hyperlink w:anchor="_Toc238032405" w:history="1">
+          <w:hyperlink w:anchor="_Toc238034316" w:history="1">
             <w:r>
               <w:rPr>
                 <w:rStyle w:val="Hyperlink"/>
@@ -796,7 +796,7 @@
               <w:rPr>
                 <w:noProof/>
               </w:rPr>
-              <w:instrText xml:space="preserve"> PAGEREF _Toc238032405 \h </w:instrText>
+              <w:instrText xml:space="preserve"> PAGEREF _Toc238034316 \h </w:instrText>
             </w:r>
             <w:r>
               <w:rPr>
@@ -841,7 +841,7 @@
               <w14:ligatures w14:val="standardContextual"/>
             </w:rPr>
           </w:pPr>
-          <w:hyperlink w:anchor="_Toc238032406" w:history="1">
+          <w:hyperlink w:anchor="_Toc238034317" w:history="1">
             <w:r>
               <w:rPr>
                 <w:rStyle w:val="Hyperlink"/>
@@ -865,7 +865,7 @@
               <w:rPr>
                 <w:noProof/>
               </w:rPr>
-              <w:instrText xml:space="preserve"> PAGEREF _Toc238032406 \h </w:instrText>
+              <w:instrText xml:space="preserve"> PAGEREF _Toc238034317 \h </w:instrText>
             </w:r>
             <w:r>
               <w:rPr>
@@ -908,7 +908,7 @@
               <w14:ligatures w14:val="standardContextual"/>
             </w:rPr>
           </w:pPr>
-          <w:hyperlink w:anchor="_Toc238032407" w:history="1">
+          <w:hyperlink w:anchor="_Toc238034318" w:history="1">
             <w:r>
               <w:rPr>
                 <w:rStyle w:val="Hyperlink"/>
@@ -932,7 +932,7 @@
               <w:rPr>
                 <w:noProof/>
               </w:rPr>
-              <w:instrText xml:space="preserve"> PAGEREF _Toc238032407 \h </w:instrText>
+              <w:instrText xml:space="preserve"> PAGEREF _Toc238034318 \h </w:instrText>
             </w:r>
             <w:r>
               <w:rPr>
@@ -975,7 +975,7 @@
               <w14:ligatures w14:val="standardContextual"/>
             </w:rPr>
           </w:pPr>
-          <w:hyperlink w:anchor="_Toc238032408" w:history="1">
+          <w:hyperlink w:anchor="_Toc238034319" w:history="1">
             <w:r>
               <w:rPr>
                 <w:rStyle w:val="Hyperlink"/>
@@ -999,7 +999,7 @@
               <w:rPr>
                 <w:noProof/>
               </w:rPr>
-              <w:instrText xml:space="preserve"> PAGEREF _Toc238032408 \h </w:instrText>
+              <w:instrText xml:space="preserve"> PAGEREF _Toc238034319 \h </w:instrText>
             </w:r>
             <w:r>
               <w:rPr>
@@ -1042,7 +1042,7 @@
               <w14:ligatures w14:val="standardContextual"/>
             </w:rPr>
           </w:pPr>
-          <w:hyperlink w:anchor="_Toc238032409" w:history="1">
+          <w:hyperlink w:anchor="_Toc238034320" w:history="1">
             <w:r>
               <w:rPr>
                 <w:rStyle w:val="Hyperlink"/>
@@ -1066,7 +1066,7 @@
               <w:rPr>
                 <w:noProof/>
               </w:rPr>
-              <w:instrText xml:space="preserve"> PAGEREF _Toc238032409 \h </w:instrText>
+              <w:instrText xml:space="preserve"> PAGEREF _Toc238034320 \h </w:instrText>
             </w:r>
             <w:r>
               <w:rPr>
@@ -1109,7 +1109,7 @@
               <w14:ligatures w14:val="standardContextual"/>
             </w:rPr>
           </w:pPr>
-          <w:hyperlink w:anchor="_Toc238032410" w:history="1">
+          <w:hyperlink w:anchor="_Toc238034321" w:history="1">
             <w:r>
               <w:rPr>
                 <w:rStyle w:val="Hyperlink"/>
@@ -1133,7 +1133,7 @@
               <w:rPr>
                 <w:noProof/>
               </w:rPr>
-              <w:instrText xml:space="preserve"> PAGEREF _Toc238032410 \h </w:instrText>
+              <w:instrText xml:space="preserve"> PAGEREF _Toc238034321 \h </w:instrText>
             </w:r>
             <w:r>
               <w:rPr>
@@ -1176,7 +1176,7 @@
               <w14:ligatures w14:val="standardContextual"/>
             </w:rPr>
           </w:pPr>
-          <w:hyperlink w:anchor="_Toc238032411" w:history="1">
+          <w:hyperlink w:anchor="_Toc238034322" w:history="1">
             <w:r>
               <w:rPr>
                 <w:rStyle w:val="Hyperlink"/>
@@ -1200,7 +1200,7 @@
               <w:rPr>
                 <w:noProof/>
               </w:rPr>
-              <w:instrText xml:space="preserve"> PAGEREF _Toc238032411 \h </w:instrText>
+              <w:instrText xml:space="preserve"> PAGEREF _Toc238034322 \h </w:instrText>
             </w:r>
             <w:r>
               <w:rPr>
@@ -1243,7 +1243,7 @@
               <w14:ligatures w14:val="standardContextual"/>
             </w:rPr>
           </w:pPr>
-          <w:hyperlink w:anchor="_Toc238032412" w:history="1">
+          <w:hyperlink w:anchor="_Toc238034323" w:history="1">
             <w:r>
               <w:rPr>
                 <w:rStyle w:val="Hyperlink"/>
@@ -1267,7 +1267,7 @@
               <w:rPr>
                 <w:noProof/>
               </w:rPr>
-              <w:instrText xml:space="preserve"> PAGEREF _Toc238032412 \h </w:instrText>
+              <w:instrText xml:space="preserve"> PAGEREF _Toc238034323 \h </w:instrText>
             </w:r>
             <w:r>
               <w:rPr>
@@ -1310,7 +1310,7 @@
               <w14:ligatures w14:val="standardContextual"/>
             </w:rPr>
           </w:pPr>
-          <w:hyperlink w:anchor="_Toc238032413" w:history="1">
+          <w:hyperlink w:anchor="_Toc238034324" w:history="1">
             <w:r>
               <w:rPr>
                 <w:rStyle w:val="Hyperlink"/>
@@ -1334,7 +1334,7 @@
               <w:rPr>
                 <w:noProof/>
               </w:rPr>
-              <w:instrText xml:space="preserve"> PAGEREF _Toc238032413 \h </w:instrText>
+              <w:instrText xml:space="preserve"> PAGEREF _Toc238034324 \h </w:instrText>
             </w:r>
             <w:r>
               <w:rPr>
@@ -1377,7 +1377,7 @@
               <w14:ligatures w14:val="standardContextual"/>
             </w:rPr>
           </w:pPr>
-          <w:hyperlink w:anchor="_Toc238032414" w:history="1">
+          <w:hyperlink w:anchor="_Toc238034325" w:history="1">
             <w:r>
               <w:rPr>
                 <w:rStyle w:val="Hyperlink"/>
@@ -1401,7 +1401,7 @@
               <w:rPr>
                 <w:noProof/>
               </w:rPr>
-              <w:instrText xml:space="preserve"> PAGEREF _Toc238032414 \h </w:instrText>
+              <w:instrText xml:space="preserve"> PAGEREF _Toc238034325 \h </w:instrText>
             </w:r>
             <w:r>
               <w:rPr>
@@ -1444,7 +1444,7 @@
               <w14:ligatures w14:val="standardContextual"/>
             </w:rPr>
           </w:pPr>
-          <w:hyperlink w:anchor="_Toc238032415" w:history="1">
+          <w:hyperlink w:anchor="_Toc238034326" w:history="1">
             <w:r>
               <w:rPr>
                 <w:rStyle w:val="Hyperlink"/>
@@ -1468,7 +1468,7 @@
               <w:rPr>
                 <w:noProof/>
               </w:rPr>
-              <w:instrText xml:space="preserve"> PAGEREF _Toc238032415 \h </w:instrText>
+              <w:instrText xml:space="preserve"> PAGEREF _Toc238034326 \h </w:instrText>
             </w:r>
             <w:r>
               <w:rPr>
@@ -1511,7 +1511,7 @@
               <w14:ligatures w14:val="standardContextual"/>
             </w:rPr>
           </w:pPr>
-          <w:hyperlink w:anchor="_Toc238032416" w:history="1">
+          <w:hyperlink w:anchor="_Toc238034327" w:history="1">
             <w:r>
               <w:rPr>
                 <w:rStyle w:val="Hyperlink"/>
@@ -1535,7 +1535,7 @@
               <w:rPr>
                 <w:noProof/>
               </w:rPr>
-              <w:instrText xml:space="preserve"> PAGEREF _Toc238032416 \h </w:instrText>
+              <w:instrText xml:space="preserve"> PAGEREF _Toc238034327 \h </w:instrText>
             </w:r>
             <w:r>
               <w:rPr>
@@ -1578,13 +1578,13 @@
               <w14:ligatures w14:val="standardContextual"/>
             </w:rPr>
           </w:pPr>
-          <w:hyperlink w:anchor="_Toc238032417" w:history="1">
+          <w:hyperlink w:anchor="_Toc238034328" w:history="1">
             <w:r>
               <w:rPr>
                 <w:rStyle w:val="Hyperlink"/>
                 <w:noProof/>
               </w:rPr>
-              <w:t>7. Spickzettel: Continue vs. Claude Code</w:t>
+              <w:t>7. Spickzettel</w:t>
             </w:r>
             <w:r>
               <w:rPr>
@@ -1602,7 +1602,7 @@
               <w:rPr>
                 <w:noProof/>
               </w:rPr>
-              <w:instrText xml:space="preserve"> PAGEREF _Toc238032417 \h </w:instrText>
+              <w:instrText xml:space="preserve"> PAGEREF _Toc238034328 \h </w:instrText>
             </w:r>
             <w:r>
               <w:rPr>
@@ -1645,7 +1645,7 @@
               <w14:ligatures w14:val="standardContextual"/>
             </w:rPr>
           </w:pPr>
-          <w:hyperlink w:anchor="_Toc238032418" w:history="1">
+          <w:hyperlink w:anchor="_Toc238034329" w:history="1">
             <w:r>
               <w:rPr>
                 <w:rStyle w:val="Hyperlink"/>
@@ -1669,7 +1669,7 @@
               <w:rPr>
                 <w:noProof/>
               </w:rPr>
-              <w:instrText xml:space="preserve"> PAGEREF _Toc238032418 \h </w:instrText>
+              <w:instrText xml:space="preserve"> PAGEREF _Toc238034329 \h </w:instrText>
             </w:r>
             <w:r>
               <w:rPr>
@@ -1712,7 +1712,7 @@
               <w14:ligatures w14:val="standardContextual"/>
             </w:rPr>
           </w:pPr>
-          <w:hyperlink w:anchor="_Toc238032419" w:history="1">
+          <w:hyperlink w:anchor="_Toc238034330" w:history="1">
             <w:r>
               <w:rPr>
                 <w:rStyle w:val="Hyperlink"/>
@@ -1736,7 +1736,7 @@
               <w:rPr>
                 <w:noProof/>
               </w:rPr>
-              <w:instrText xml:space="preserve"> PAGEREF _Toc238032419 \h </w:instrText>
+              <w:instrText xml:space="preserve"> PAGEREF _Toc238034330 \h </w:instrText>
             </w:r>
             <w:r>
               <w:rPr>
@@ -1753,7 +1753,7 @@
               <w:rPr>
                 <w:noProof/>
               </w:rPr>
-              <w:t>20</w:t>
+              <w:t>19</w:t>
             </w:r>
             <w:r>
               <w:rPr>
@@ -1779,7 +1779,7 @@
       <w:pPr>
         <w:pStyle w:val="Heading1"/>
       </w:pPr>
-      <w:bookmarkStart w:id="0" w:name="_Toc238032396"/>
+      <w:bookmarkStart w:id="0" w:name="_Toc238034307"/>
       <w:r>
         <w:lastRenderedPageBreak/>
         <w:t>Teil I — Die Methode</w:t>
@@ -1790,7 +1790,7 @@
       <w:pPr>
         <w:pStyle w:val="Heading2"/>
       </w:pPr>
-      <w:bookmarkStart w:id="1" w:name="_Toc238032397"/>
+      <w:bookmarkStart w:id="1" w:name="_Toc238034308"/>
       <w:r>
         <w:t>1. Was ist SDD — und woher es kommt</w:t>
       </w:r>
@@ -1988,7 +1988,7 @@
       <w:pPr>
         <w:pStyle w:val="Heading2"/>
       </w:pPr>
-      <w:bookmarkStart w:id="2" w:name="_Toc238032398"/>
+      <w:bookmarkStart w:id="2" w:name="_Toc238034309"/>
       <w:r>
         <w:t>2. Das Problem: „Vibe Coding“</w:t>
       </w:r>
@@ -2087,7 +2087,7 @@
       <w:pPr>
         <w:pStyle w:val="Heading2"/>
       </w:pPr>
-      <w:bookmarkStart w:id="3" w:name="_Toc238032399"/>
+      <w:bookmarkStart w:id="3" w:name="_Toc238034310"/>
       <w:r>
         <w:lastRenderedPageBreak/>
         <w:t>3. Die Prinzipien des SDD</w:t>
@@ -2330,7 +2330,7 @@
       <w:pPr>
         <w:pStyle w:val="Heading2"/>
       </w:pPr>
-      <w:bookmarkStart w:id="4" w:name="_Toc238032400"/>
+      <w:bookmarkStart w:id="4" w:name="_Toc238034311"/>
       <w:r>
         <w:t>4. Das Spezifikationsdokument</w:t>
       </w:r>
@@ -2363,7 +2363,7 @@
         </w:rPr>
         <w:lastRenderedPageBreak/>
         <w:drawing>
-          <wp:anchor distT="0" distB="0" distL="114300" distR="114300" simplePos="0" relativeHeight="251658240" behindDoc="1" locked="0" layoutInCell="1" allowOverlap="1" wp14:anchorId="456F44F6" wp14:editId="46B548DD">
+          <wp:anchor distT="0" distB="0" distL="114300" distR="114300" simplePos="0" relativeHeight="251658240" behindDoc="1" locked="0" layoutInCell="1" allowOverlap="1" wp14:anchorId="456F44F6" wp14:editId="531479BA">
             <wp:simplePos x="0" y="0"/>
             <wp:positionH relativeFrom="column">
               <wp:posOffset>139065</wp:posOffset>
@@ -3782,7 +3782,7 @@
       <w:pPr>
         <w:pStyle w:val="Heading2"/>
       </w:pPr>
-      <w:bookmarkStart w:id="5" w:name="_Toc238032401"/>
+      <w:bookmarkStart w:id="5" w:name="_Toc238034312"/>
       <w:r>
         <w:rPr>
           <w:noProof/>
@@ -4216,7 +4216,7 @@
       <w:pPr>
         <w:pStyle w:val="Heading2"/>
       </w:pPr>
-      <w:bookmarkStart w:id="6" w:name="_Toc238032402"/>
+      <w:bookmarkStart w:id="6" w:name="_Toc238034313"/>
       <w:r>
         <w:t>6. Werkzeuglandschaft</w:t>
       </w:r>
@@ -4295,7 +4295,7 @@
       <w:pPr>
         <w:pStyle w:val="Heading2"/>
       </w:pPr>
-      <w:bookmarkStart w:id="7" w:name="_Toc238032403"/>
+      <w:bookmarkStart w:id="7" w:name="_Toc238034314"/>
       <w:r>
         <w:t>7. Grenzen — und wann SDD sich nicht lohnt</w:t>
       </w:r>
@@ -4432,7 +4432,7 @@
       <w:pPr>
         <w:pStyle w:val="Heading2"/>
       </w:pPr>
-      <w:bookmarkStart w:id="8" w:name="_Toc238032404"/>
+      <w:bookmarkStart w:id="8" w:name="_Toc238034315"/>
       <w:r>
         <w:lastRenderedPageBreak/>
         <w:t>8. Spezifikationen schnell erstellen: der Meta-Prompt</w:t>
@@ -5118,7 +5118,7 @@
       <w:pPr>
         <w:pStyle w:val="Heading2"/>
       </w:pPr>
-      <w:bookmarkStart w:id="9" w:name="_Toc238032405"/>
+      <w:bookmarkStart w:id="9" w:name="_Toc238034316"/>
       <w:r>
         <w:lastRenderedPageBreak/>
         <w:t>9. Glossar</w:t>
@@ -5361,7 +5361,7 @@
       <w:pPr>
         <w:pStyle w:val="Heading1"/>
       </w:pPr>
-      <w:bookmarkStart w:id="10" w:name="_Toc238032406"/>
+      <w:bookmarkStart w:id="10" w:name="_Toc238034317"/>
       <w:r>
         <w:lastRenderedPageBreak/>
         <w:t>Teil II — In der Praxis: Tutorial am Beispiel Predictive Maintenance</w:t>
@@ -5372,7 +5372,7 @@
       <w:pPr>
         <w:pStyle w:val="Heading2"/>
       </w:pPr>
-      <w:bookmarkStart w:id="11" w:name="_Toc238032407"/>
+      <w:bookmarkStart w:id="11" w:name="_Toc238034318"/>
       <w:r>
         <w:t>Bevor du loslegst: iterativ statt Wasserfall</w:t>
       </w:r>
@@ -6038,7 +6038,7 @@
       <w:pPr>
         <w:pStyle w:val="Heading2"/>
       </w:pPr>
-      <w:bookmarkStart w:id="12" w:name="_Toc238032408"/>
+      <w:bookmarkStart w:id="12" w:name="_Toc238034319"/>
       <w:r>
         <w:lastRenderedPageBreak/>
         <w:t>0. Voraussetzungen &amp; Setup</w:t>
@@ -6106,7 +6106,23 @@
                 <w:bCs/>
                 <w:color w:val="23306B"/>
               </w:rPr>
-              <w:t>So geht's in Continue (VS Code)</w:t>
+              <w:t xml:space="preserve">So geht's in </w:t>
+            </w:r>
+            <w:r>
+              <w:rPr>
+                <w:b/>
+                <w:bCs/>
+                <w:color w:val="23306B"/>
+              </w:rPr>
+              <w:t>Kilo Code</w:t>
+            </w:r>
+            <w:r>
+              <w:rPr>
+                <w:b/>
+                <w:bCs/>
+                <w:color w:val="23306B"/>
+              </w:rPr>
+              <w:t xml:space="preserve"> (VS Code)</w:t>
             </w:r>
           </w:p>
           <w:p>
@@ -6119,7 +6135,19 @@
               <w:spacing w:after="90" w:line="272" w:lineRule="auto"/>
             </w:pPr>
             <w:r>
-              <w:t>In VS Code links auf „Extensions“ gehen, nach „Continue“ suchen, installieren. Danach erscheint links das Continue-Symbol — darüber öffnet sich das Seitenpanel.</w:t>
+              <w:t>In VS Code links auf „Extensions“ gehen, nach „</w:t>
+            </w:r>
+            <w:r>
+              <w:t>Kilo Code</w:t>
+            </w:r>
+            <w:r>
+              <w:t xml:space="preserve">“ suchen, installieren. Danach erscheint links das </w:t>
+            </w:r>
+            <w:r>
+              <w:t>Kilo Code</w:t>
+            </w:r>
+            <w:r>
+              <w:t>-Symbol — darüber öffnet sich das Seitenpanel.</w:t>
             </w:r>
           </w:p>
           <w:p>
@@ -6145,7 +6173,10 @@
               <w:spacing w:after="90" w:line="272" w:lineRule="auto"/>
             </w:pPr>
             <w:r>
-              <w:t xml:space="preserve">Continue kennt vier Funktionen: </w:t>
+              <w:t>Kilo Code</w:t>
+            </w:r>
+            <w:r>
+              <w:t xml:space="preserve"> kennt vier Funktionen: </w:t>
             </w:r>
             <w:r>
               <w:rPr>
@@ -6424,7 +6455,7 @@
       <w:pPr>
         <w:pStyle w:val="Heading2"/>
       </w:pPr>
-      <w:bookmarkStart w:id="13" w:name="_Toc238032409"/>
+      <w:bookmarkStart w:id="13" w:name="_Toc238034320"/>
       <w:r>
         <w:lastRenderedPageBreak/>
         <w:t>1. Die Spezifikation erstellen — die Planungsphase</w:t>
@@ -6604,7 +6635,23 @@
                 <w:bCs/>
                 <w:color w:val="23306B"/>
               </w:rPr>
-              <w:t>So geht's in Continue (VS Code)</w:t>
+              <w:t xml:space="preserve">So geht's in </w:t>
+            </w:r>
+            <w:r>
+              <w:rPr>
+                <w:b/>
+                <w:bCs/>
+                <w:color w:val="23306B"/>
+              </w:rPr>
+              <w:t>Kilo Code</w:t>
+            </w:r>
+            <w:r>
+              <w:rPr>
+                <w:b/>
+                <w:bCs/>
+                <w:color w:val="23306B"/>
+              </w:rPr>
+              <w:t xml:space="preserve"> (VS Code)</w:t>
             </w:r>
           </w:p>
           <w:p>
@@ -6617,7 +6664,7 @@
               <w:spacing w:after="90" w:line="272" w:lineRule="auto"/>
             </w:pPr>
             <w:r>
-              <w:t xml:space="preserve">Neuen Chat mit Strg/Cmd + L öffnen. Im Auswahlfeld den </w:t>
+              <w:t xml:space="preserve">Neuen Chat öffnen. Im Auswahlfeld den </w:t>
             </w:r>
             <w:r>
               <w:rPr>
@@ -6696,7 +6743,13 @@
               <w:t>Agent-Modus</w:t>
             </w:r>
             <w:r>
-              <w:t xml:space="preserve"> kann Continue die Datei direkt anlegen.</w:t>
+              <w:t xml:space="preserve"> kann </w:t>
+            </w:r>
+            <w:r>
+              <w:t>Kilo Code</w:t>
+            </w:r>
+            <w:r>
+              <w:t xml:space="preserve"> die Datei direkt anlegen.</w:t>
             </w:r>
           </w:p>
         </w:tc>
@@ -6858,7 +6911,7 @@
       <w:pPr>
         <w:pStyle w:val="Heading2"/>
       </w:pPr>
-      <w:bookmarkStart w:id="14" w:name="_Toc238032410"/>
+      <w:bookmarkStart w:id="14" w:name="_Toc238034321"/>
       <w:r>
         <w:lastRenderedPageBreak/>
         <w:t>2. Das Fundament: die Spec ins Projekt legen</w:t>
@@ -7003,7 +7056,7 @@
         <w:pStyle w:val="Heading2"/>
         <w:spacing w:before="260" w:after="120"/>
       </w:pPr>
-      <w:bookmarkStart w:id="15" w:name="_Toc238032411"/>
+      <w:bookmarkStart w:id="15" w:name="_Toc238034322"/>
       <w:r>
         <w:rPr>
           <w:color w:val="24292F"/>
@@ -7284,7 +7337,31 @@
                 <w:sz w:val="20"/>
                 <w:szCs w:val="20"/>
               </w:rPr>
-              <w:t>du – im Interview mit der KI</w:t>
+              <w:t>KI-Agent unter deiner Führung</w:t>
+            </w:r>
+            <w:r>
+              <w:rPr>
+                <w:color w:val="24292F"/>
+                <w:sz w:val="20"/>
+                <w:szCs w:val="20"/>
+              </w:rPr>
+              <w:t xml:space="preserve"> – </w:t>
+            </w:r>
+            <w:r>
+              <w:rPr>
+                <w:color w:val="24292F"/>
+                <w:sz w:val="20"/>
+                <w:szCs w:val="20"/>
+              </w:rPr>
+              <w:t xml:space="preserve">nach </w:t>
+            </w:r>
+            <w:r>
+              <w:rPr>
+                <w:color w:val="24292F"/>
+                <w:sz w:val="20"/>
+                <w:szCs w:val="20"/>
+              </w:rPr>
+              <w:t>Interview mit der KI</w:t>
             </w:r>
           </w:p>
         </w:tc>
@@ -7492,7 +7569,7 @@
         <w:pStyle w:val="Heading2"/>
         <w:spacing w:before="260" w:after="120"/>
       </w:pPr>
-      <w:bookmarkStart w:id="16" w:name="_Toc238032412"/>
+      <w:bookmarkStart w:id="16" w:name="_Toc238034323"/>
       <w:r>
         <w:rPr>
           <w:color w:val="24292F"/>
@@ -9185,7 +9262,7 @@
       <w:pPr>
         <w:pStyle w:val="Heading2"/>
       </w:pPr>
-      <w:bookmarkStart w:id="17" w:name="_Toc238032413"/>
+      <w:bookmarkStart w:id="17" w:name="_Toc238034324"/>
       <w:r>
         <w:lastRenderedPageBreak/>
         <w:t>3. Spec prüfen und Plan erzeugen — noch ohne Code</w:t>
@@ -9268,7 +9345,23 @@
                 <w:iCs/>
                 <w:color w:val="2B2F36"/>
               </w:rPr>
-              <w:t>Lies @spec.md und @CLAUDE.md. Du bist erfahrener Senior-Entwickler. Prüfe die</w:t>
+              <w:t>Lies @spec.md und @</w:t>
+            </w:r>
+            <w:r>
+              <w:rPr>
+                <w:i/>
+                <w:iCs/>
+                <w:color w:val="2B2F36"/>
+              </w:rPr>
+              <w:t>constitution</w:t>
+            </w:r>
+            <w:r>
+              <w:rPr>
+                <w:i/>
+                <w:iCs/>
+                <w:color w:val="2B2F36"/>
+              </w:rPr>
+              <w:t>.md. Du bist erfahrener Senior-Entwickler. Prüfe die</w:t>
             </w:r>
           </w:p>
           <w:p>
@@ -9872,7 +9965,7 @@
       <w:pPr>
         <w:pStyle w:val="Heading2"/>
       </w:pPr>
-      <w:bookmarkStart w:id="18" w:name="_Toc238032414"/>
+      <w:bookmarkStart w:id="18" w:name="_Toc238034325"/>
       <w:r>
         <w:lastRenderedPageBreak/>
         <w:t>4. In kleine Aufgaben zerlegen</w:t>
@@ -10132,7 +10225,7 @@
       <w:pPr>
         <w:pStyle w:val="Heading2"/>
       </w:pPr>
-      <w:bookmarkStart w:id="19" w:name="_Toc238032415"/>
+      <w:bookmarkStart w:id="19" w:name="_Toc238034326"/>
       <w:r>
         <w:t>5. Implementieren — Tests zuerst</w:t>
       </w:r>
@@ -10191,25 +10284,47 @@
                 <w:bCs/>
                 <w:color w:val="23306B"/>
               </w:rPr>
-              <w:t>So geht's in Continue (VS Code)</w:t>
-            </w:r>
-          </w:p>
-          <w:p>
-            <w:pPr>
-              <w:spacing w:line="276" w:lineRule="auto"/>
-            </w:pPr>
-            <w:r>
-              <w:t xml:space="preserve">In den </w:t>
+              <w:t xml:space="preserve">So geht's in </w:t>
             </w:r>
             <w:r>
               <w:rPr>
                 <w:b/>
                 <w:bCs/>
+                <w:color w:val="23306B"/>
+              </w:rPr>
+              <w:t>Kilo Code</w:t>
+            </w:r>
+            <w:r>
+              <w:rPr>
+                <w:b/>
+                <w:bCs/>
+                <w:color w:val="23306B"/>
+              </w:rPr>
+              <w:t xml:space="preserve"> (VS Code)</w:t>
+            </w:r>
+          </w:p>
+          <w:p>
+            <w:pPr>
+              <w:spacing w:line="276" w:lineRule="auto"/>
+            </w:pPr>
+            <w:r>
+              <w:t xml:space="preserve">In den </w:t>
+            </w:r>
+            <w:r>
+              <w:rPr>
+                <w:b/>
+                <w:bCs/>
               </w:rPr>
               <w:t>Agent-Modus</w:t>
             </w:r>
             <w:r>
-              <w:t xml:space="preserve"> wechseln. Jetzt kann Continue Dateien schreiben und das Terminal nutzen. </w:t>
+              <w:t xml:space="preserve"> wechseln. Jetzt kann </w:t>
+            </w:r>
+            <w:r>
+              <w:t>Kilo Code</w:t>
+            </w:r>
+            <w:r>
+              <w:t xml:space="preserve"> Dateien schreiben und das Terminal nutzen. </w:t>
             </w:r>
             <w:r>
               <w:rPr>
@@ -10652,7 +10767,7 @@
       <w:pPr>
         <w:pStyle w:val="Heading2"/>
       </w:pPr>
-      <w:bookmarkStart w:id="20" w:name="_Toc238032416"/>
+      <w:bookmarkStart w:id="20" w:name="_Toc238034327"/>
       <w:r>
         <w:t>6. Verifizieren &amp; weiterentwickeln</w:t>
       </w:r>
@@ -10676,19 +10791,16 @@
         <w:t xml:space="preserve"> ab.</w:t>
       </w:r>
       <w:r>
-        <w:t xml:space="preserve"> </w:t>
-      </w:r>
-      <w:r>
-        <w:t>Neue Wünsche oder gefundene Fehler kommen ZUERST in spec.md — nie als formloser Zuruf an den Code. Erst danach lässt du den Agenten anpassen. Sonst entsteht „Spec-Drift“: Code und Spezifikation laufen auseinander.</w:t>
+        <w:t xml:space="preserve"> Neue Wünsche oder gefundene Fehler kommen ZUERST in spec.md — nie als formloser Zuruf an den Code. Erst danach lässt du den Agenten anpassen. Sonst entsteht „Spec-Drift“: Code und Spezifikation laufen auseinander.</w:t>
       </w:r>
     </w:p>
     <w:p>
       <w:pPr>
         <w:pStyle w:val="Heading2"/>
       </w:pPr>
-      <w:bookmarkStart w:id="21" w:name="_Toc238032417"/>
-      <w:r>
-        <w:t>7. Spickzettel: Continue vs. Claude Code</w:t>
+      <w:bookmarkStart w:id="21" w:name="_Toc238034328"/>
+      <w:r>
+        <w:t>7. Spickzettel</w:t>
       </w:r>
       <w:bookmarkEnd w:id="21"/>
     </w:p>
@@ -11098,7 +11210,7 @@
       <w:pPr>
         <w:pStyle w:val="Heading2"/>
       </w:pPr>
-      <w:bookmarkStart w:id="22" w:name="_Toc238032418"/>
+      <w:bookmarkStart w:id="22" w:name="_Toc238034329"/>
       <w:r>
         <w:t>8. Häufige Stolpersteine</w:t>
       </w:r>
@@ -11208,7 +11320,7 @@
       <w:pPr>
         <w:pStyle w:val="Heading2"/>
       </w:pPr>
-      <w:bookmarkStart w:id="23" w:name="_Toc238032419"/>
+      <w:bookmarkStart w:id="23" w:name="_Toc238034330"/>
       <w:r>
         <w:t>Quellen &amp; weiterführende Links</w:t>
       </w:r>

</xml_diff>